<commit_message>
S3: the telling order belongs to the leaders (John's call on the v2.11 sibling flag) — standalone S3 pairs no longer fix Companion-first; arranged beforehand, with Companion-first kept as a depth-setting lever in the notes; small-room cue follows; combined form's cue gains the lever note; changelog v2.14
Co-Authored-By: Claude Fable 5 <noreply@anthropic.com>
</commit_message>
<xml_diff>
--- a/_implementation-notes/evening-series/FotH Evening Session 3 Leader Notes DRAFT v1.docx
+++ b/_implementation-notes/evening-series/FotH Evening Session 3 Leader Notes DRAFT v1.docx
@@ -669,7 +669,7 @@
         <w:t>CUES:</w:t>
       </w:r>
       <w:r>
-        <w:t xml:space="preserve"> Teen storytelling cards (H3.2) go home today for Week 4. Ten or fewer — stay one circle; the arranged parent tells after the Companion.</w:t>
+        <w:t xml:space="preserve"> Teen storytelling cards (H3.2) go home today for Week 4. Ten or fewer — stay one circle; the arranged telling order holds.</w:t>
       </w:r>
     </w:p>
     <w:p>
@@ -718,7 +718,7 @@
         <w:ind w:left="216"/>
       </w:pPr>
       <w:r>
-        <w:t>1. In each pair: the Companion tells first, then the arranged parent, then the remaining parents. 5–7 minutes per story, 10 seconds of silence, 1–2 minute blessing round.</w:t>
+        <w:t>1. In each pair: the telling order is arranged beforehand — Companion-first stays available as a depth-setting lever when a pair needs it. 5–7 minutes per story, 10 seconds of silence, 1–2 minute blessing round.</w:t>
       </w:r>
     </w:p>
     <w:p>

</xml_diff>